<commit_message>
docs(paper): refocus integration paper on QGC-OpenUxAS architecture + message exchange + verification
- retitle: 무인기 협업, 탐색 및 임무 자동화를 위한 OpenUxAS와 QGC 연동 검증
- content: integration architecture (Fig.1), message exchange (Table 1:
  LMCP/ZeroMQ + MAVLink + EventBroadcaster), end-to-end verification
  (river search -> 24-pt task -> 26-waypoint mission upload)
- heterogeneous multi-vehicle cooperation deferred to a follow-up paper

Co-Authored-By: Claude Opus 4.8 (1M context) <noreply@anthropic.com>
</commit_message>
<xml_diff>
--- a/tools/test-automation/docs/paper_integration_ksas_ko.docx
+++ b/tools/test-automation/docs/paper_integration_ksas_ko.docx
@@ -9,7 +9,7 @@
         <w:rPr/>
       </w:pPr>
       <w:r>
-        <w:t>QGroundControl–OpenUxAS 연동을 통한 이기종 무인기 협업 탐색 임무 자동화</w:t>
+        <w:t>무인기 협업, 탐색 및 임무 자동화를 위한 OpenUxAS와 QGC 연동 검증</w:t>
       </w:r>
     </w:p>
     <w:p>
@@ -49,7 +49,7 @@
         <w:rPr/>
       </w:pPr>
       <w:r>
-        <w:t>Automation of Heterogeneous Multi-UAV Cooperative Search Missions through QGroundControl–OpenUxAS Integration</w:t>
+        <w:t>Verification of OpenUxAS–QGroundControl Integration for UAV Cooperation, Search, and Mission Automation</w:t>
       </w:r>
     </w:p>
     <w:p>
@@ -81,7 +81,7 @@
         <w:rPr/>
       </w:pPr>
       <w:r>
-        <w:t>Key Words : OpenUxAS, QGroundControl, 무인기(UAV), 이기종 협업(Heterogeneous Cooperation), 임무 계획(Mission Planning), 탐색-구조(Search and Rescue)</w:t>
+        <w:t>Key Words : OpenUxAS, QGroundControl, MAVLink, LMCP, 무인기(UAV), 시스템 연동(System Integration)</w:t>
       </w:r>
     </w:p>
     <w:p>
@@ -129,7 +129,7 @@
         <w:pStyle w:val="Style20"/>
       </w:pPr>
       <w:r>
-        <w:t>이기종 무인기의 협업 탐색 임무를 실제 비행체로 검증하려면 자율 임무 서비스와 표준 지상통제 소프트웨어의 연동이 필요하다. 본 연구는 지상통제 소프트웨어 QGroundControl(QGC)과 자율 임무 서비스 OpenUxAS를 실시간 연동하는 브리지를 구현하였다. 비행체 상태를 OpenUxAS로 스트리밍하고 계획된 경로를 PX4 미션으로 변환하며, 지도 기반 도로·하천 검색과 기종별 계층 분할 탐색을 지원한다. PX4 시뮬레이션에서 하천 검색과 4기 이기종 협업 탐색의 종단 간 연동을 검증하였다.</w:t>
+        <w:t>다수 무인기의 협업·탐색·임무 자동화를 위해 자율 임무 서비스 OpenUxAS가 널리 활용되나, 이를 표준 지상통제 소프트웨어 및 실제 비행제어기와 연동하여 검증하는 방안은 정립되어 있지 않다. OpenUxAS는 경량 메시징 프로토콜(LMCP)을 ZeroMQ로 주고받는 반면, 지상통제소는 MAVLink 기반으로 동작하기 때문이다. 본 논문은 지상통제 소프트웨어 QGroundControl(QGC)과 OpenUxAS를 연동하는 아키텍처와 두 체계 간 메시지 교환 방식을 제시하고, PX4 시뮬레이션을 통해 연동이 종단 간 동작함을 검증한다.</w:t>
       </w:r>
     </w:p>
     <w:p>
@@ -154,7 +154,7 @@
         <w:t>(1)</w:t>
       </w:r>
       <w:r>
-        <w:t>가 널리 활용된다. 그러나 OpenUxAS의 계획을 실제 비행제어기 PX4</w:t>
+        <w:t>가 널리 쓰인다. OpenUxAS는 탐색 과업과 배정을 계획하여 각 비행체의 경로를 산출하지만, 그 결과를 실제 비행제어기 PX4</w:t>
       </w:r>
       <w:r>
         <w:rPr>
@@ -163,7 +163,7 @@
         <w:t>(2)</w:t>
       </w:r>
       <w:r>
-        <w:t xml:space="preserve"> 및 표준 지상통제 소프트웨어와 연동하여 운용·검증하는 통합은 자명하지 않다. OpenUxAS는 경량 메시징 프로토콜(LMCP)과 ZeroMQ로 통신하는 반면, 지상통제소는 MAVLink</w:t>
+        <w:t xml:space="preserve"> 및 운용자가 사용하는 표준 지상통제 소프트웨어와 연결해 운용·검증하는 통합은 자명하지 않다. OpenUxAS는 LMCP 메시지를 ZeroMQ로 송수신하는 반면, 지상통제소는 MAVLink</w:t>
       </w:r>
       <w:r>
         <w:rPr>
@@ -172,7 +172,7 @@
         <w:t>(3)</w:t>
       </w:r>
       <w:r>
-        <w:t xml:space="preserve"> 기반으로 동작하기 때문이다.</w:t>
+        <w:t>로 비행체와 통신하기 때문이다.</w:t>
       </w:r>
     </w:p>
     <w:p>
@@ -180,7 +180,7 @@
         <w:pStyle w:val="Style20"/>
       </w:pPr>
       <w:r>
-        <w:t>본 연구는 오픈소스 지상통제 소프트웨어 QGroundControl(QGC)</w:t>
+        <w:t>본 논문의 목적은 이기종 협업·탐색 알고리즘 자체가 아니라, 오픈소스 지상통제 소프트웨어 QGroundControl(QGC)</w:t>
       </w:r>
       <w:r>
         <w:rPr>
@@ -189,7 +189,7 @@
         <w:t>(4)</w:t>
       </w:r>
       <w:r>
-        <w:t>과 OpenUxAS를 실시간 연동하여, 운용자가 지도에서 지정한 영역에 대해 도로·하천 검색과 이기종 협업 탐색을 계획하고 이를 PX4 시뮬레이션 비행체로 수행·검증하는 통합 방안을 제안하고 그 동작을 검증한다.</w:t>
+        <w:t>과 OpenUxAS를 연동하는 방법과 그 검증에 있다. 구체적으로 (1) 두 체계를 잇는 임무 브리지 아키텍처, (2) 두 체계가 주고받는 메시지의 종류와 흐름, (3) PX4 시뮬레이션 상에서의 종단 간 연동 검증을 제시한다. 이기종 다수 비행체를 이용한 협업 시뮬레이션과 성능 평가는 후속 논문에서 다룬다.</w:t>
       </w:r>
     </w:p>
     <w:p>
@@ -197,15 +197,7 @@
         <w:pStyle w:val="Style19"/>
       </w:pPr>
       <w:r>
-        <w:t>시스템 구성 및 연동</w:t>
-      </w:r>
-    </w:p>
-    <w:p>
-      <w:pPr>
-        <w:pStyle w:val="Style14"/>
-      </w:pPr>
-      <w:r>
-        <w:t>전체 구성 및 임무 브리지</w:t>
+        <w:t>연동 아키텍처</w:t>
       </w:r>
     </w:p>
     <w:p>
@@ -213,15 +205,62 @@
         <w:pStyle w:val="Style20"/>
       </w:pPr>
       <w:r>
-        <w:t>시스템은 QGC, 임무 브리지, OpenUxAS, PX4 SITL 시뮬레이션으로 구성된다. 브리지는 QGC·PX4의 MAVLink와 OpenUxAS의 LMCP/ZeroMQ 메시지를 상호 변환한다. 각 비행체의 상태(AirVehicleState)와 카메라 구성을 OpenUxAS로 주기적으로 스트리밍하고, OpenUxAS가 계획한 경로(MissionCommand)를 수신하여 PX4 미션으로 업로드·활성화한다. 고정익의 경우 활공각 제약을 만족하도록 착륙 항로점을 부가한다. QGC에는 검색 지시와 결과 표시를 위한 이벤트 채널을 추가하였다.</w:t>
-      </w:r>
-    </w:p>
-    <w:p>
-      <w:pPr>
-        <w:pStyle w:val="Style14"/>
-      </w:pPr>
-      <w:r>
-        <w:t>지형 기반 검색 계획</w:t>
+        <w:t>전체 구성은 Fig. 1과 같이 QGroundControl, 임무 브리지(Mission Bridge), OpenUxAS, 그리고 PX4 SITL 시뮬레이션으로 이루어진다. 임무 브리지는 서로 다른 두 통신 규약을 연결하는 핵심 요소다. 브리지는 PX4로부터 MAVLink로 비행체 상태를 수신하고 이를 OpenUxAS가 이해하는 LMCP 메시지로 변환하여 ZeroMQ로 전달하며, 반대로 OpenUxAS가 산출한 경로를 MAVLink 미션으로 변환하여 PX4에 업로드한다. QGC는 운용자에게 지도 기반 검색 지시와 결과 표시를 제공하며, QGC에 내장한 EventBroadcaster 모듈이 브리지·리스너와 UDP로 통신하여 검색 발행과 계획 결과를 주고받는다.</w:t>
+      </w:r>
+    </w:p>
+    <w:p>
+      <w:pPr>
+        <w:jc w:val="center"/>
+      </w:pPr>
+      <w:r>
+        <w:drawing>
+          <wp:inline xmlns:a="http://schemas.openxmlformats.org/drawingml/2006/main" xmlns:pic="http://schemas.openxmlformats.org/drawingml/2006/picture">
+            <wp:extent cx="2926080" cy="1490945"/>
+            <wp:docPr id="1" name="Picture 1"/>
+            <wp:cNvGraphicFramePr>
+              <a:graphicFrameLocks noChangeAspect="1"/>
+            </wp:cNvGraphicFramePr>
+            <a:graphic>
+              <a:graphicData uri="http://schemas.openxmlformats.org/drawingml/2006/picture">
+                <pic:pic>
+                  <pic:nvPicPr>
+                    <pic:cNvPr id="0" name="arch_fig.png"/>
+                    <pic:cNvPicPr/>
+                  </pic:nvPicPr>
+                  <pic:blipFill>
+                    <a:blip r:embed="rId10"/>
+                    <a:stretch>
+                      <a:fillRect/>
+                    </a:stretch>
+                  </pic:blipFill>
+                  <pic:spPr>
+                    <a:xfrm>
+                      <a:off x="0" y="0"/>
+                      <a:ext cx="2926080" cy="1490945"/>
+                    </a:xfrm>
+                    <a:prstGeom prst="rect"/>
+                  </pic:spPr>
+                </pic:pic>
+              </a:graphicData>
+            </a:graphic>
+          </wp:inline>
+        </w:drawing>
+      </w:r>
+    </w:p>
+    <w:p>
+      <w:pPr>
+        <w:pStyle w:val="Style22"/>
+      </w:pPr>
+      <w:r>
+        <w:t>Fig. 1. System architecture of the QGroundControl–OpenUxAS integration.</w:t>
+      </w:r>
+    </w:p>
+    <w:p>
+      <w:pPr>
+        <w:pStyle w:val="Style19"/>
+      </w:pPr>
+      <w:r>
+        <w:t>메시지 교환</w:t>
       </w:r>
     </w:p>
     <w:p>
@@ -229,15 +268,390 @@
         <w:pStyle w:val="Style20"/>
       </w:pPr>
       <w:r>
-        <w:t>운용자가 QGC 지도 패널에서 지정한 영역의 도로·하천 지형을 국가공간정보(VWorld)에서 취득하여 OpenUxAS 검색 과업으로 발행한다. 도로는 선 탐색(LineSearch)으로, 하천은 수면 폴리곤에서 주성분 분석 기반 중심선을 추출하여 선 탐색으로 변환한다. 넓은 하천에 대해서는 잔디깎기식 면 탐색(AreaSearch) 옵션을 제공한다.</w:t>
-      </w:r>
-    </w:p>
-    <w:p>
-      <w:pPr>
-        <w:pStyle w:val="Style14"/>
-      </w:pPr>
-      <w:r>
-        <w:t>이기종 협업 탐색-구조(SAR)</w:t>
+        <w:t>두 체계가 주고받는 주요 메시지와 전송 규약을 Table 1에 정리하였다. 브리지는 상향 방향으로 각 비행체의 구성(AirVehicleConfiguration)과 상태(AirVehicleState)를 OpenUxAS에 등록·스트리밍하고, 운용자가 지정한 검색 과업(LineSearchTask/AreaSearchTask)과 운용 영역(OperatingRegion), 자동화 요청(AutomationRequest)을 발행한다. 하향 방향으로 OpenUxAS는 자동화 응답(AutomationResponse)에 담긴 경로(MissionCommand)를 반환하고, 브리지는 이를 MAVLink 미션 항목으로 변환하여 PX4에 업로드·활성화한다. QGC와 브리지·리스너 사이의 검색 지시·계획 표시는 UDP 기반 EventBroadcaster로 전달된다.</w:t>
+      </w:r>
+    </w:p>
+    <w:p>
+      <w:pPr>
+        <w:pStyle w:val="Style22"/>
+      </w:pPr>
+      <w:r>
+        <w:t>Table 1. Messages exchanged across the integration.</w:t>
+      </w:r>
+    </w:p>
+    <w:tbl>
+      <w:tblPr>
+        <w:tblStyle w:val="af0"/>
+        <w:tblW w:type="auto" w:w="0"/>
+        <w:tblLook w:firstColumn="1" w:firstRow="1" w:lastColumn="0" w:lastRow="0" w:noHBand="0" w:noVBand="1" w:val="04A0"/>
+      </w:tblPr>
+      <w:tblGrid>
+        <w:gridCol w:w="3213"/>
+        <w:gridCol w:w="3213"/>
+        <w:gridCol w:w="3213"/>
+      </w:tblGrid>
+      <w:tr>
+        <w:tc>
+          <w:tcPr>
+            <w:tcW w:type="dxa" w:w="3213"/>
+          </w:tcPr>
+          <w:p>
+            <w:r/>
+            <w:r>
+              <w:rPr>
+                <w:b/>
+                <w:sz w:val="16"/>
+              </w:rPr>
+              <w:t>Message</w:t>
+            </w:r>
+          </w:p>
+        </w:tc>
+        <w:tc>
+          <w:tcPr>
+            <w:tcW w:type="dxa" w:w="3213"/>
+          </w:tcPr>
+          <w:p>
+            <w:r/>
+            <w:r>
+              <w:rPr>
+                <w:b/>
+                <w:sz w:val="16"/>
+              </w:rPr>
+              <w:t>Protocol</w:t>
+            </w:r>
+          </w:p>
+        </w:tc>
+        <w:tc>
+          <w:tcPr>
+            <w:tcW w:type="dxa" w:w="3213"/>
+          </w:tcPr>
+          <w:p>
+            <w:r/>
+            <w:r>
+              <w:rPr>
+                <w:b/>
+                <w:sz w:val="16"/>
+              </w:rPr>
+              <w:t>Direction</w:t>
+            </w:r>
+          </w:p>
+        </w:tc>
+      </w:tr>
+      <w:tr>
+        <w:tc>
+          <w:tcPr>
+            <w:tcW w:type="dxa" w:w="3213"/>
+          </w:tcPr>
+          <w:p>
+            <w:r/>
+            <w:r>
+              <w:rPr>
+                <w:sz w:val="16"/>
+              </w:rPr>
+              <w:t>AirVehicleConfiguration / AirVehicleState</w:t>
+            </w:r>
+          </w:p>
+        </w:tc>
+        <w:tc>
+          <w:tcPr>
+            <w:tcW w:type="dxa" w:w="3213"/>
+          </w:tcPr>
+          <w:p>
+            <w:r/>
+            <w:r>
+              <w:rPr>
+                <w:sz w:val="16"/>
+              </w:rPr>
+              <w:t>LMCP/ZeroMQ</w:t>
+            </w:r>
+          </w:p>
+        </w:tc>
+        <w:tc>
+          <w:tcPr>
+            <w:tcW w:type="dxa" w:w="3213"/>
+          </w:tcPr>
+          <w:p>
+            <w:r/>
+            <w:r>
+              <w:rPr>
+                <w:sz w:val="16"/>
+              </w:rPr>
+              <w:t>Bridge → OpenUxAS</w:t>
+            </w:r>
+          </w:p>
+        </w:tc>
+      </w:tr>
+      <w:tr>
+        <w:tc>
+          <w:tcPr>
+            <w:tcW w:type="dxa" w:w="3213"/>
+          </w:tcPr>
+          <w:p>
+            <w:r/>
+            <w:r>
+              <w:rPr>
+                <w:sz w:val="16"/>
+              </w:rPr>
+              <w:t>LineSearchTask / AreaSearchTask</w:t>
+            </w:r>
+          </w:p>
+        </w:tc>
+        <w:tc>
+          <w:tcPr>
+            <w:tcW w:type="dxa" w:w="3213"/>
+          </w:tcPr>
+          <w:p>
+            <w:r/>
+            <w:r>
+              <w:rPr>
+                <w:sz w:val="16"/>
+              </w:rPr>
+              <w:t>LMCP/ZeroMQ</w:t>
+            </w:r>
+          </w:p>
+        </w:tc>
+        <w:tc>
+          <w:tcPr>
+            <w:tcW w:type="dxa" w:w="3213"/>
+          </w:tcPr>
+          <w:p>
+            <w:r/>
+            <w:r>
+              <w:rPr>
+                <w:sz w:val="16"/>
+              </w:rPr>
+              <w:t>Bridge → OpenUxAS</w:t>
+            </w:r>
+          </w:p>
+        </w:tc>
+      </w:tr>
+      <w:tr>
+        <w:tc>
+          <w:tcPr>
+            <w:tcW w:type="dxa" w:w="3213"/>
+          </w:tcPr>
+          <w:p>
+            <w:r/>
+            <w:r>
+              <w:rPr>
+                <w:sz w:val="16"/>
+              </w:rPr>
+              <w:t>OperatingRegion / AutomationRequest</w:t>
+            </w:r>
+          </w:p>
+        </w:tc>
+        <w:tc>
+          <w:tcPr>
+            <w:tcW w:type="dxa" w:w="3213"/>
+          </w:tcPr>
+          <w:p>
+            <w:r/>
+            <w:r>
+              <w:rPr>
+                <w:sz w:val="16"/>
+              </w:rPr>
+              <w:t>LMCP/ZeroMQ</w:t>
+            </w:r>
+          </w:p>
+        </w:tc>
+        <w:tc>
+          <w:tcPr>
+            <w:tcW w:type="dxa" w:w="3213"/>
+          </w:tcPr>
+          <w:p>
+            <w:r/>
+            <w:r>
+              <w:rPr>
+                <w:sz w:val="16"/>
+              </w:rPr>
+              <w:t>Bridge → OpenUxAS</w:t>
+            </w:r>
+          </w:p>
+        </w:tc>
+      </w:tr>
+      <w:tr>
+        <w:tc>
+          <w:tcPr>
+            <w:tcW w:type="dxa" w:w="3213"/>
+          </w:tcPr>
+          <w:p>
+            <w:r/>
+            <w:r>
+              <w:rPr>
+                <w:sz w:val="16"/>
+              </w:rPr>
+              <w:t>AutomationResponse (MissionCommand)</w:t>
+            </w:r>
+          </w:p>
+        </w:tc>
+        <w:tc>
+          <w:tcPr>
+            <w:tcW w:type="dxa" w:w="3213"/>
+          </w:tcPr>
+          <w:p>
+            <w:r/>
+            <w:r>
+              <w:rPr>
+                <w:sz w:val="16"/>
+              </w:rPr>
+              <w:t>LMCP/ZeroMQ</w:t>
+            </w:r>
+          </w:p>
+        </w:tc>
+        <w:tc>
+          <w:tcPr>
+            <w:tcW w:type="dxa" w:w="3213"/>
+          </w:tcPr>
+          <w:p>
+            <w:r/>
+            <w:r>
+              <w:rPr>
+                <w:sz w:val="16"/>
+              </w:rPr>
+              <w:t>OpenUxAS → Bridge</w:t>
+            </w:r>
+          </w:p>
+        </w:tc>
+      </w:tr>
+      <w:tr>
+        <w:tc>
+          <w:tcPr>
+            <w:tcW w:type="dxa" w:w="3213"/>
+          </w:tcPr>
+          <w:p>
+            <w:r/>
+            <w:r>
+              <w:rPr>
+                <w:sz w:val="16"/>
+              </w:rPr>
+              <w:t>MISSION_ITEM / MISSION_CURRENT</w:t>
+            </w:r>
+          </w:p>
+        </w:tc>
+        <w:tc>
+          <w:tcPr>
+            <w:tcW w:type="dxa" w:w="3213"/>
+          </w:tcPr>
+          <w:p>
+            <w:r/>
+            <w:r>
+              <w:rPr>
+                <w:sz w:val="16"/>
+              </w:rPr>
+              <w:t>MAVLink</w:t>
+            </w:r>
+          </w:p>
+        </w:tc>
+        <w:tc>
+          <w:tcPr>
+            <w:tcW w:type="dxa" w:w="3213"/>
+          </w:tcPr>
+          <w:p>
+            <w:r/>
+            <w:r>
+              <w:rPr>
+                <w:sz w:val="16"/>
+              </w:rPr>
+              <w:t>Bridge ↔ PX4</w:t>
+            </w:r>
+          </w:p>
+        </w:tc>
+      </w:tr>
+      <w:tr>
+        <w:tc>
+          <w:tcPr>
+            <w:tcW w:type="dxa" w:w="3213"/>
+          </w:tcPr>
+          <w:p>
+            <w:r/>
+            <w:r>
+              <w:rPr>
+                <w:sz w:val="16"/>
+              </w:rPr>
+              <w:t>GLOBAL_POSITION_INT / telemetry</w:t>
+            </w:r>
+          </w:p>
+        </w:tc>
+        <w:tc>
+          <w:tcPr>
+            <w:tcW w:type="dxa" w:w="3213"/>
+          </w:tcPr>
+          <w:p>
+            <w:r/>
+            <w:r>
+              <w:rPr>
+                <w:sz w:val="16"/>
+              </w:rPr>
+              <w:t>MAVLink</w:t>
+            </w:r>
+          </w:p>
+        </w:tc>
+        <w:tc>
+          <w:tcPr>
+            <w:tcW w:type="dxa" w:w="3213"/>
+          </w:tcPr>
+          <w:p>
+            <w:r/>
+            <w:r>
+              <w:rPr>
+                <w:sz w:val="16"/>
+              </w:rPr>
+              <w:t>PX4 → QGC / Bridge</w:t>
+            </w:r>
+          </w:p>
+        </w:tc>
+      </w:tr>
+      <w:tr>
+        <w:tc>
+          <w:tcPr>
+            <w:tcW w:type="dxa" w:w="3213"/>
+          </w:tcPr>
+          <w:p>
+            <w:r/>
+            <w:r>
+              <w:rPr>
+                <w:sz w:val="16"/>
+              </w:rPr>
+              <w:t>search publish / plan mirror</w:t>
+            </w:r>
+          </w:p>
+        </w:tc>
+        <w:tc>
+          <w:tcPr>
+            <w:tcW w:type="dxa" w:w="3213"/>
+          </w:tcPr>
+          <w:p>
+            <w:r/>
+            <w:r>
+              <w:rPr>
+                <w:sz w:val="16"/>
+              </w:rPr>
+              <w:t>UDP (EventBroadcaster)</w:t>
+            </w:r>
+          </w:p>
+        </w:tc>
+        <w:tc>
+          <w:tcPr>
+            <w:tcW w:type="dxa" w:w="3213"/>
+          </w:tcPr>
+          <w:p>
+            <w:r/>
+            <w:r>
+              <w:rPr>
+                <w:sz w:val="16"/>
+              </w:rPr>
+              <w:t>QGC ↔ Bridge/Listener</w:t>
+            </w:r>
+          </w:p>
+        </w:tc>
+      </w:tr>
+    </w:tbl>
+    <w:p>
+      <w:pPr>
+        <w:pStyle w:val="Style19"/>
+      </w:pPr>
+      <w:r>
+        <w:t>연동 검증</w:t>
       </w:r>
     </w:p>
     <w:p>
@@ -245,7 +659,15 @@
         <w:pStyle w:val="Style20"/>
       </w:pPr>
       <w:r>
-        <w:t>탐색-구조 임무에서는 하나의 영역을 기종 능력에 따라 계층으로 분할한다. 고정익은 넓은 영역을 높은 고도·넓은 시야각으로, 멀티콥터는 핵심 영역을 낮은 고도·좁은 시야각으로, 지상 무인체는 도로를 따라 담당한다. 각 과업을 적격 기체(EligibleEntities)로 제한하고 운용 영역(OperatingRegion)과 함께 하나의 자동화 요청(AutomationRequest)으로 묶어, OpenUxAS가 이동 비용을 최소화하는 능력 기반 배정을 수행하도록 한다. 또한 패널의 카메라 시야각을 브리지가 비행체 상태에 반영하여 탐색 항로 간격이 지상 촬영 풋프린트와 일치하도록 한다.</w:t>
+        <w:t>연동이 종단 간 동작하는지 확인하기 위해 도심 하천 영역에 대한 검색을 발행하고 그 결과를 추적하였다. 운용자가 QGC 지도에서 지정한 하천 영역은 검색 과업으로 변환되어 OpenUxAS에 발행되었고, OpenUxAS는 이를 배정하여 자동화 응답을 반환하였다. 브리지는 응답에 담긴 경로를 MAVLink 미션으로 변환하여 PX4에 업로드하고 임무를 활성화하였다.</w:t>
+      </w:r>
+    </w:p>
+    <w:p>
+      <w:pPr>
+        <w:pStyle w:val="Style20"/>
+      </w:pPr>
+      <w:r>
+        <w:t>구체적으로 하천 중심선 24개 점으로 구성된 선 탐색 과업이 생성되고, OpenUxAS의 자동화 응답을 거쳐 해당 비행체에 착륙 항로점을 포함한 26개 항로점의 미션이 업로드·활성화됨을 확인하였다. 또한 브리지가 스트리밍한 비행체 상태가 OpenUxAS의 배정에 정상 반영되며, 운용 영역이 부여되지 않은 요청은 미충족 상태로 처리되어 경로가 생성되지 않음을 함께 관찰하였다. 이로써 지도 지정→과업/요청 발행→능력 기반 배정→실제 비행체 미션 업로드까지의 연동이 정상 동작함을 검증하였다.</w:t>
       </w:r>
     </w:p>
     <w:p>
@@ -253,15 +675,7 @@
         <w:pStyle w:val="Style19"/>
       </w:pPr>
       <w:r>
-        <w:t>연동 검증</w:t>
-      </w:r>
-    </w:p>
-    <w:p>
-      <w:pPr>
-        <w:pStyle w:val="Style14"/>
-      </w:pPr>
-      <w:r>
-        <w:t>하천 검색 연동</w:t>
+        <w:t>결 론</w:t>
       </w:r>
     </w:p>
     <w:p>
@@ -269,39 +683,7 @@
         <w:pStyle w:val="Style20"/>
       </w:pPr>
       <w:r>
-        <w:t>도심 하천(한강) 영역을 대상으로 하천 검색을 발행한 결과, 중심선 24개 점의 선 탐색 과업이 생성되고 OpenUxAS의 자동화 응답을 거쳐 해당 비행체에 26개 항로점의 미션이 업로드·활성화됨을 확인하였다. 지도 지정에서 실제 비행체 미션까지 종단 간 연동이 동작한다.</w:t>
-      </w:r>
-    </w:p>
-    <w:p>
-      <w:pPr>
-        <w:pStyle w:val="Style14"/>
-      </w:pPr>
-      <w:r>
-        <w:t>이기종 협업 배정 검증</w:t>
-      </w:r>
-    </w:p>
-    <w:p>
-      <w:pPr>
-        <w:pStyle w:val="Style20"/>
-      </w:pPr>
-      <w:r>
-        <w:t>고정익 2기와 멀티콥터 2기(총 4기)를 대상으로 단일 자동화 요청을 발행한 결과, 4기 모두에 미션이 생성되었다. 고정익은 전체 영역을 약 250 m 고도에서, 멀티콥터는 내부 핵심 영역을 약 60 m 고도에서 담당하도록 고도와 영역이 기종별로 분리 배정되었다. 이는 적격 기체 제한과 능력 기반 배정이 의도대로 동작함을 보인다. 운용 영역을 부여하지 않으면 요청이 미충족 상태로 처리되어 경로가 생성되지 않음을 함께 확인하였다.</w:t>
-      </w:r>
-    </w:p>
-    <w:p>
-      <w:pPr>
-        <w:pStyle w:val="Style19"/>
-      </w:pPr>
-      <w:r>
-        <w:t>결 론</w:t>
-      </w:r>
-    </w:p>
-    <w:p>
-      <w:pPr>
-        <w:pStyle w:val="Style20"/>
-      </w:pPr>
-      <w:r>
-        <w:t>본 연구는 QGroundControl과 OpenUxAS를 실시간 연동하는 임무 브리지를 구현하고, 지형 기반 검색과 이기종 협업 탐색을 PX4 시뮬레이션에서 종단 간 검증하였다. 지도 지정→과업 생성→능력 기반 배정→실제 비행체 미션까지의 연동이 다기종 협업 임무에 대해 동작함을 확인하였으며, 이는 자율 임무 서비스의 실기체 연계 검증에 활용될 수 있다.</w:t>
+        <w:t>본 논문은 자율 임무 서비스 OpenUxAS와 표준 지상통제 소프트웨어 QGroundControl을 연동하는 임무 브리지 아키텍처와 두 체계 간 메시지 교환 방식을 제시하고, PX4 시뮬레이션에서 하천 검색을 대상으로 종단 간 연동을 검증하였다. 제안한 연동은 OpenUxAS의 계획을 실제 비행체 운용으로 연결하는 기반이 되며, 이기종 다수 비행체 협업 시뮬레이션과 성능 평가는 후속 연구로 수행한다.</w:t>
       </w:r>
     </w:p>
     <w:p>

</xml_diff>